<commit_message>
Corrige acentuacao no Word processo_entrega_garantia_devolucao_tablets_glpi
</commit_message>
<xml_diff>
--- a/documentações/Processos/docx/processo_entrega_garantia_devolucao_tablets_glpi.docx
+++ b/documentações/Processos/docx/processo_entrega_garantia_devolucao_tablets_glpi.docx
@@ -41,7 +41,7 @@
           <w:color w:val="5E6B78"/>
           <w:sz w:val="19"/>
         </w:rPr>
-        <w:t>Ãrea responsÃ¡vel e versÃ£o conforme documentaÃ§Ã£o institucional</w:t>
+        <w:t>Área responsável e versão conforme documentação institucional</w:t>
       </w:r>
     </w:p>
     <w:p>
@@ -5099,6 +5099,8 @@
     <w:sectPr>
       <w:headerReference w:type="default" r:id="rId9"/>
       <w:footerReference w:type="default" r:id="rId10"/>
+      <w:headerReference w:type="first" r:id="rId11"/>
+      <w:footerReference w:type="first" r:id="rId12"/>
       <w:pgSz w:w="12240" w:h="15840"/>
       <w:pgMar w:top="1080" w:right="1123" w:bottom="1080" w:left="1123" w:header="504" w:footer="504" w:gutter="0"/>
       <w:cols w:space="720"/>
@@ -5121,7 +5123,7 @@
         <w:color w:val="5E6B78"/>
         <w:sz w:val="17"/>
       </w:rPr>
-      <w:t xml:space="preserve">Secretaria de SaÃºde do Recife  |  </w:t>
+      <w:t xml:space="preserve">Secretaria de Saúde do Recife  |  </w:t>
     </w:r>
     <w:r>
       <w:rPr>
@@ -5129,9 +5131,19 @@
         <w:color w:val="5E6B78"/>
         <w:sz w:val="18"/>
       </w:rPr>
-      <w:t xml:space="preserve">PÃ¡gina </w:t>
+      <w:t xml:space="preserve">Página </w:t>
     </w:r>
     <w:fldSimple w:instr="PAGE"/>
+  </w:p>
+</w:ftr>
+</file>
+
+<file path=word/footer2.xml><?xml version="1.0" encoding="utf-8"?>
+<w:ftr xmlns:m="http://schemas.openxmlformats.org/officeDocument/2006/math" xmlns:mc="http://schemas.openxmlformats.org/markup-compatibility/2006" xmlns:mo="http://schemas.microsoft.com/office/mac/office/2008/main" xmlns:mv="urn:schemas-microsoft-com:mac:vml" xmlns:o="urn:schemas-microsoft-com:office:office" xmlns:r="http://schemas.openxmlformats.org/officeDocument/2006/relationships" xmlns:v="urn:schemas-microsoft-com:vml" xmlns:w10="urn:schemas-microsoft-com:office:word" xmlns:w14="http://schemas.microsoft.com/office/word/2010/wordml" xmlns:w="http://schemas.openxmlformats.org/wordprocessingml/2006/main" xmlns:wne="http://schemas.microsoft.com/office/word/2006/wordml" xmlns:wp14="http://schemas.microsoft.com/office/word/2010/wordprocessingDrawing" xmlns:wp="http://schemas.openxmlformats.org/drawingml/2006/wordprocessingDrawing" xmlns:wpc="http://schemas.microsoft.com/office/word/2010/wordprocessingCanvas" xmlns:wpg="http://schemas.microsoft.com/office/word/2010/wordprocessingGroup" xmlns:wpi="http://schemas.microsoft.com/office/word/2010/wordprocessingInk" xmlns:wps="http://schemas.microsoft.com/office/word/2010/wordprocessingShape" mc:Ignorable="w14 wp14">
+  <w:p>
+    <w:pPr>
+      <w:pStyle w:val="Footer"/>
+    </w:pPr>
   </w:p>
 </w:ftr>
 </file>
@@ -5150,8 +5162,18 @@
         <w:color w:val="5E6B78"/>
         <w:sz w:val="17"/>
       </w:rPr>
-      <w:t>SAÃšDE DIGITAL ATENDE  |  PROCESSO OPERACIONAL</w:t>
+      <w:t>SAÚDE DIGITAL ATENDE  |  PROCESSO OPERACIONAL</w:t>
     </w:r>
+  </w:p>
+</w:hdr>
+</file>
+
+<file path=word/header2.xml><?xml version="1.0" encoding="utf-8"?>
+<w:hdr xmlns:m="http://schemas.openxmlformats.org/officeDocument/2006/math" xmlns:mc="http://schemas.openxmlformats.org/markup-compatibility/2006" xmlns:mo="http://schemas.microsoft.com/office/mac/office/2008/main" xmlns:mv="urn:schemas-microsoft-com:mac:vml" xmlns:o="urn:schemas-microsoft-com:office:office" xmlns:r="http://schemas.openxmlformats.org/officeDocument/2006/relationships" xmlns:v="urn:schemas-microsoft-com:vml" xmlns:w10="urn:schemas-microsoft-com:office:word" xmlns:w14="http://schemas.microsoft.com/office/word/2010/wordml" xmlns:w="http://schemas.openxmlformats.org/wordprocessingml/2006/main" xmlns:wne="http://schemas.microsoft.com/office/word/2006/wordml" xmlns:wp14="http://schemas.microsoft.com/office/word/2010/wordprocessingDrawing" xmlns:wp="http://schemas.openxmlformats.org/drawingml/2006/wordprocessingDrawing" xmlns:wpc="http://schemas.microsoft.com/office/word/2010/wordprocessingCanvas" xmlns:wpg="http://schemas.microsoft.com/office/word/2010/wordprocessingGroup" xmlns:wpi="http://schemas.microsoft.com/office/word/2010/wordprocessingInk" xmlns:wps="http://schemas.microsoft.com/office/word/2010/wordprocessingShape" mc:Ignorable="w14 wp14">
+  <w:p>
+    <w:pPr>
+      <w:pStyle w:val="Header"/>
+    </w:pPr>
   </w:p>
 </w:hdr>
 </file>

</xml_diff>

<commit_message>
Atualiza Word padronizado processo_entrega_garantia_devolucao_tablets_glpi
</commit_message>
<xml_diff>
--- a/documentações/Processos/docx/processo_entrega_garantia_devolucao_tablets_glpi.docx
+++ b/documentações/Processos/docx/processo_entrega_garantia_devolucao_tablets_glpi.docx
@@ -425,7 +425,7 @@
         <w:pStyle w:val="Heading1"/>
       </w:pPr>
       <w:r>
-        <w:t>Objetivo e catálogo</w:t>
+        <w:t>Objetivo</w:t>
       </w:r>
     </w:p>
     <w:p>
@@ -1061,7 +1061,7 @@
         <w:pStyle w:val="Heading1"/>
       </w:pPr>
       <w:r>
-        <w:t>Referências de apoio</w:t>
+        <w:t>Fluxo resumido</w:t>
       </w:r>
     </w:p>
     <w:p>
@@ -1069,15 +1069,7 @@
         <w:pStyle w:val="Heading1"/>
       </w:pPr>
       <w:r>
-        <w:t>Fluxo comum de abertura no GLPI</w:t>
-      </w:r>
-    </w:p>
-    <w:p>
-      <w:pPr>
-        <w:pStyle w:val="Heading1"/>
-      </w:pPr>
-      <w:r>
-        <w:t>Processo 1 CONFIGURAÇÃO</w:t>
+        <w:t>Processo 1 - Configuração</w:t>
       </w:r>
     </w:p>
     <w:tbl>
@@ -1708,7 +1700,7 @@
         <w:pStyle w:val="Heading1"/>
       </w:pPr>
       <w:r>
-        <w:t>Processo 2 EMPRÉSTIMO / DEVOLUÇÃO</w:t>
+        <w:t>Processo 2 - Empréstimo / Devolução</w:t>
       </w:r>
     </w:p>
     <w:tbl>
@@ -2437,7 +2429,7 @@
         <w:pStyle w:val="Heading1"/>
       </w:pPr>
       <w:r>
-        <w:t>Processo 3 TRANSFERÊNCIA / LIBERAÇÃO</w:t>
+        <w:t>Processo 3 - Transferência / Liberação</w:t>
       </w:r>
     </w:p>
     <w:tbl>
@@ -3068,7 +3060,7 @@
         <w:pStyle w:val="Heading1"/>
       </w:pPr>
       <w:r>
-        <w:t>Processo 4 MANUTENÇÃO CORRETIVA</w:t>
+        <w:t>Processo 4 - Manutenção Corretiva</w:t>
       </w:r>
     </w:p>
     <w:tbl>
@@ -3993,7 +3985,7 @@
         <w:pStyle w:val="Heading1"/>
       </w:pPr>
       <w:r>
-        <w:t>Processo 5 FURTO / ROUBO / PERDA</w:t>
+        <w:t>Processo 5 - Furto / Roubo / Perda</w:t>
       </w:r>
     </w:p>
     <w:tbl>
@@ -4624,6 +4616,14 @@
         <w:pStyle w:val="Heading1"/>
       </w:pPr>
       <w:r>
+        <w:t>Referências de apoio</w:t>
+      </w:r>
+    </w:p>
+    <w:p>
+      <w:pPr>
+        <w:pStyle w:val="Heading1"/>
+      </w:pPr>
+      <w:r>
         <w:t>Modelos de registro e mensagem</w:t>
       </w:r>
     </w:p>
@@ -4764,7 +4764,7 @@
         <w:pStyle w:val="Heading1"/>
       </w:pPr>
       <w:r>
-        <w:t>Histórico de Revisões</w:t>
+        <w:t>Histórico de Revisão</w:t>
       </w:r>
     </w:p>
     <w:tbl>

</xml_diff>